<commit_message>
Resume: add React Native to skills
</commit_message>
<xml_diff>
--- a/public/resume.docx
+++ b/public/resume.docx
@@ -541,6 +541,28 @@
           <w:color w:val="0F172A"/>
           <w:sz w:val="19"/>
         </w:rPr>
+        <w:t xml:space="preserve">Mobile:  </w:t>
+      </w:r>
+      <w:r>
+        <w:rPr>
+          <w:rFonts w:ascii="Inter" w:hAnsi="Inter" w:eastAsia="Inter"/>
+          <w:color w:val="334155"/>
+          <w:sz w:val="19"/>
+        </w:rPr>
+        <w:t>React Native</w:t>
+      </w:r>
+    </w:p>
+    <w:p>
+      <w:pPr>
+        <w:spacing w:before="0" w:after="40" w:line="269" w:lineRule="auto"/>
+      </w:pPr>
+      <w:r>
+        <w:rPr>
+          <w:rFonts w:ascii="Inter" w:hAnsi="Inter" w:eastAsia="Inter"/>
+          <w:b/>
+          <w:color w:val="0F172A"/>
+          <w:sz w:val="19"/>
+        </w:rPr>
         <w:t xml:space="preserve">State &amp; Data:  </w:t>
       </w:r>
       <w:r>

</xml_diff>